<commit_message>
feat: Azure Blueprint 관련 문제 삭제 (서비스 2026-07-11 종료)
- 2-1 Azure핵심아키텍처: Q4 Blueprint 예/아니오 문제 3개 제거
- 3-2 거버넌스및규정준수: Q2 Blueprint 매칭 문제 제거
- parser.py Blueprint 관련 오버라이드 제거
- DB Blueprint 해설 삭제

Co-Authored-By: Claude Sonnet 4.6 <noreply@anthropic.com>
</commit_message>
<xml_diff>
--- a/questions/2-1_Azure핵심아키텍처_2부 (37문제).docx
+++ b/questions/2-1_Azure핵심아키텍처_2부 (37문제).docx
@@ -12,7 +12,7 @@
     </w:p>
     <w:p>
       <w:r>
-        <w:t>총 15문제</w:t>
+        <w:t>총 14문제</w:t>
       </w:r>
     </w:p>
     <w:p/>
@@ -123,37 +123,6 @@
         <w:br/>
         <w:t>119</w:t>
       </w:r>
-    </w:p>
-    <w:p/>
-    <w:p>
-      <w:r>
-        <w:rPr>
-          <w:b/>
-          <w:color w:val="C00000"/>
-        </w:rPr>
-        <w:t xml:space="preserve">Q4. </w:t>
-      </w:r>
-      <w:r>
-        <w:t>121. 예 아니오 문제</w:t>
-        <w:br/>
-        <w:t>Azure Resource Manager 템플릿을 Azure Blueprint에 추가할 수 있습니다.</w:t>
-        <w:br/>
-        <w:t>리소스 그룹에 Azure Blueprint를 할당할 수 있습니다.</w:t>
-        <w:br/>
-        <w:t>Azure Blueprint를 사용하여 리소스에 사용 권한을 부여할 수 있습니다.</w:t>
-      </w:r>
-    </w:p>
-    <w:p>
-      <w:r>
-        <w:rPr>
-          <w:b/>
-          <w:color w:val="0000FF"/>
-        </w:rPr>
-        <w:t>A. 예-아니오-예</w:t>
-        <w:br/>
-        <w:t>121</w:t>
-      </w:r>
-      <w:r/>
     </w:p>
     <w:p/>
     <w:p>

</xml_diff>